<commit_message>
Literature v2: Nuyts/Hyland PDFs integrated; Leech 2003->Leech 2004, Millar 2009 via Bowie et al. 2013, Donohue substituted (Deng et al. 2024 + Resche 2015); draft v2 citations updated
Co-Authored-By: Claude Fable 5 <noreply@anthropic.com>
Claude-Session: https://claude.ai/code/session_01XFp1HY5nhPT9uSRFki1RFQ
</commit_message>
<xml_diff>
--- a/paper/draft_v2.docx
+++ b/paper/draft_v2.docx
@@ -375,7 +375,7 @@
         <w:pStyle w:val="BodyText"/>
       </w:pPr>
       <w:r>
-        <w:t xml:space="preserve">The linguistic literature on the English modals supplies the descriptive tools: the epistemic/deontic/dynamic semantics of the modal auxiliaries (Coates, 1983; Palmer, 1990, 2001), their register-specific diachrony (Leech, 2003; Millar, 2009; Collins, 2009), collostructional analysis of the association between a construction and its lexical fillers (Stefanowitsch &amp; Gries, 2003; Gries &amp; Stefanowitsch, 2004), and the study of formulaic sequences and lexical bundles in institutional registers (Biber et al., 1999; Wray, 2002; Biber &amp; Barbieri, 2007). The economics literature supplies the macro anchors: a real-activity index observable in real time (the Chicago Fed National Activity Index) and a market-priced uncertainty index (the VIX), the pairing that keeps our design comparable to Kawamura et al.’s leading-index-plus-volatility specification.</w:t>
+        <w:t xml:space="preserve">The linguistic literature on the English modals supplies the descriptive tools: the epistemic/deontic/dynamic semantics of the modal auxiliaries (Coates, 1983; Palmer, 1990, 2001), their register-specific diachrony (Leech, 2004; Bowie et al., 2013; Collins, 2009), collostructional analysis of the association between a construction and its lexical fillers (Stefanowitsch &amp; Gries, 2003; Gries &amp; Stefanowitsch, 2004), and the study of formulaic sequences and lexical bundles in institutional registers (Biber et al., 1999; Wray, 2002; Biber &amp; Barbieri, 2007). The economics literature supplies the macro anchors: a real-activity index observable in real time (the Chicago Fed National Activity Index) and a market-priced uncertainty index (the VIX), the pairing that keeps our design comparable to Kawamura et al.’s leading-index-plus-volatility specification.</w:t>
       </w:r>
     </w:p>
     <w:p>
@@ -903,17 +903,81 @@
         <w:pStyle w:val="BodyText"/>
       </w:pPr>
       <w:r>
-        <w:t xml:space="preserve">Diachronic corpus work shows that the modals are not stable in frequency: the core modals declined in late-twentieth-century written English, with</w:t>
-      </w:r>
-      <w:r>
-        <w:t xml:space="preserve"> </w:t>
-      </w:r>
-      <w:r>
-        <w:rPr>
-          <w:i/>
-          <w:iCs/>
-        </w:rPr>
-        <w:t xml:space="preserve">shall, must, ought</w:t>
+        <w:t xml:space="preserve">Diachronic corpus work shows that the modals are not stable in frequency: between 1961 and 1991/92 the core modals fell by 9.5% in written British and 12.2% in written American English, with</w:t>
+      </w:r>
+      <w:r>
+        <w:t xml:space="preserve"> </w:t>
+      </w:r>
+      <w:r>
+        <w:rPr>
+          <w:i/>
+          <w:iCs/>
+        </w:rPr>
+        <w:t xml:space="preserve">shall</w:t>
+      </w:r>
+      <w:r>
+        <w:t xml:space="preserve"> </w:t>
+      </w:r>
+      <w:r>
+        <w:t xml:space="preserve">(−44%),</w:t>
+      </w:r>
+      <w:r>
+        <w:t xml:space="preserve"> </w:t>
+      </w:r>
+      <w:r>
+        <w:rPr>
+          <w:i/>
+          <w:iCs/>
+        </w:rPr>
+        <w:t xml:space="preserve">must</w:t>
+      </w:r>
+      <w:r>
+        <w:t xml:space="preserve"> </w:t>
+      </w:r>
+      <w:r>
+        <w:t xml:space="preserve">(−29% to −34%) and</w:t>
+      </w:r>
+      <w:r>
+        <w:t xml:space="preserve"> </w:t>
+      </w:r>
+      <w:r>
+        <w:rPr>
+          <w:i/>
+          <w:iCs/>
+        </w:rPr>
+        <w:t xml:space="preserve">may</w:t>
+      </w:r>
+      <w:r>
+        <w:t xml:space="preserve"> </w:t>
+      </w:r>
+      <w:r>
+        <w:t xml:space="preserve">(−17% to −32%) declining steeply,</w:t>
+      </w:r>
+      <w:r>
+        <w:t xml:space="preserve"> </w:t>
+      </w:r>
+      <w:r>
+        <w:rPr>
+          <w:i/>
+          <w:iCs/>
+        </w:rPr>
+        <w:t xml:space="preserve">should</w:t>
+      </w:r>
+      <w:r>
+        <w:t xml:space="preserve"> </w:t>
+      </w:r>
+      <w:r>
+        <w:t xml:space="preserve">declining moderately (−12% to −14%), and</w:t>
+      </w:r>
+      <w:r>
+        <w:t xml:space="preserve"> </w:t>
+      </w:r>
+      <w:r>
+        <w:rPr>
+          <w:i/>
+          <w:iCs/>
+        </w:rPr>
+        <w:t xml:space="preserve">will, would, can</w:t>
       </w:r>
       <w:r>
         <w:t xml:space="preserve"> </w:t>
@@ -929,29 +993,45 @@
           <w:i/>
           <w:iCs/>
         </w:rPr>
+        <w:t xml:space="preserve">could</w:t>
+      </w:r>
+      <w:r>
+        <w:t xml:space="preserve"> </w:t>
+      </w:r>
+      <w:r>
+        <w:t xml:space="preserve">nearly stable (Leech, 2004, pp. 66–67; Mair &amp; Leech, 2006; Leech et al., 2009). At the same time, a single publication or genre can move sharply against the community-wide trend:</w:t>
+      </w:r>
+      <w:r>
+        <w:t xml:space="preserve"> </w:t>
+      </w:r>
+      <w:r>
+        <w:rPr>
+          <w:i/>
+          <w:iCs/>
+        </w:rPr>
         <w:t xml:space="preserve">may</w:t>
       </w:r>
       <w:r>
         <w:t xml:space="preserve"> </w:t>
       </w:r>
       <w:r>
-        <w:t xml:space="preserve">falling steeply and</w:t>
-      </w:r>
-      <w:r>
-        <w:t xml:space="preserve"> </w:t>
-      </w:r>
-      <w:r>
-        <w:rPr>
-          <w:i/>
-          <w:iCs/>
-        </w:rPr>
-        <w:t xml:space="preserve">should</w:t>
-      </w:r>
-      <w:r>
-        <w:t xml:space="preserve"> </w:t>
-      </w:r>
-      <w:r>
-        <w:t xml:space="preserve">declining (Leech, 2003; Leech et al., 2009), while a single edited publication can move against community-wide trends under its own editorial conventions (Millar, 2009). Our data allow a complementary test at meeting-level resolution inside one institution.</w:t>
+        <w:t xml:space="preserve">rose by 54% in</w:t>
+      </w:r>
+      <w:r>
+        <w:t xml:space="preserve"> </w:t>
+      </w:r>
+      <w:r>
+        <w:rPr>
+          <w:i/>
+          <w:iCs/>
+        </w:rPr>
+        <w:t xml:space="preserve">TIME</w:t>
+      </w:r>
+      <w:r>
+        <w:t xml:space="preserve"> </w:t>
+      </w:r>
+      <w:r>
+        <w:t xml:space="preserve">magazine over the same decades in which it fell by roughly a third in the matched reference corpora — a divergence attributed to that magazine’s editorial shift towards speculative reporting (Millar, 2009, as discussed in Bowie, Wallis &amp; Aarts, 2013, pp. 59–60) — and modal use rises steeply in some spoken genres while most decline (Bowie et al., 2013). Our data allow a complementary test at meeting-level resolution inside one institution.</w:t>
       </w:r>
     </w:p>
     <w:bookmarkEnd w:id="11"/>
@@ -985,7 +1065,7 @@
         <w:t xml:space="preserve"> </w:t>
       </w:r>
       <w:r>
-        <w:t xml:space="preserve">(Hyland, 1996, 1998), and economic forecasting is a hedging-dense register (Pindi &amp; Bloor, 1987; Donohue, 2006). Resche (2015), analysing 103 central bankers’ speeches from 2008–2013, counts 4.5–5.8% of running words as classical hedging devices but argues that hedging in this discourse is diffuse — justification, historical reference, metaphor — so that counting devices without co-text</w:t>
+        <w:t xml:space="preserve">(Hyland, 1996, 1998), and central-bank and economic-forecast discourse is hedging-dense — the Federal Reserve Chair’s press conferences alone run to roughly 758 hedges per 10,000 words (Deng, Ali &amp; Zin, 2024). Resche (2015), analysing 103 central bankers’ speeches from 2008–2013, counts 4.5–5.8% of running words as classical hedging devices but argues that hedging in this discourse is diffuse — justification, historical reference, metaphor — so that counting devices without co-text</w:t>
       </w:r>
       <w:r>
         <w:t xml:space="preserve"> </w:t>
@@ -4916,7 +4996,7 @@
         <w:t xml:space="preserve"> </w:t>
       </w:r>
       <w:r>
-        <w:t xml:space="preserve">declines everywhere (consistent with the community-wide decline; Leech, 2003), the</w:t>
+        <w:t xml:space="preserve">declines everywhere (consistent with the community-wide decline; Leech, 2004), the</w:t>
       </w:r>
       <w:r>
         <w:t xml:space="preserve"> </w:t>
@@ -8193,6 +8273,39 @@
         <w:pStyle w:val="BodyText"/>
       </w:pPr>
       <w:r>
+        <w:t xml:space="preserve">Bowie, J., Wallis, S., &amp; Aarts, B. (2013). Contemporary change in modal usage in spoken British English: Mapping the impact of</w:t>
+      </w:r>
+      <w:r>
+        <w:t xml:space="preserve"> </w:t>
+      </w:r>
+      <w:r>
+        <w:t xml:space="preserve">“genre”</w:t>
+      </w:r>
+      <w:r>
+        <w:t xml:space="preserve">. In J. I. Marín-Arrese, M. Carretero, J. Arús Hita, &amp; J. van der Auwera (Eds.),</w:t>
+      </w:r>
+      <w:r>
+        <w:t xml:space="preserve"> </w:t>
+      </w:r>
+      <w:r>
+        <w:rPr>
+          <w:i/>
+          <w:iCs/>
+        </w:rPr>
+        <w:t xml:space="preserve">English modality: Core, periphery and evidentiality</w:t>
+      </w:r>
+      <w:r>
+        <w:t xml:space="preserve"> </w:t>
+      </w:r>
+      <w:r>
+        <w:t xml:space="preserve">(pp. 57–94). De Gruyter Mouton.</w:t>
+      </w:r>
+    </w:p>
+    <w:p>
+      <w:pPr>
+        <w:pStyle w:val="BodyText"/>
+      </w:pPr>
+      <w:r>
         <w:t xml:space="preserve">Bholat, D., Hansen, S., Santos, P., &amp; Schonhardt-Bailey, C. (2015).</w:t>
       </w:r>
       <w:r>
@@ -8367,6 +8480,27 @@
         <w:pStyle w:val="BodyText"/>
       </w:pPr>
       <w:r>
+        <w:t xml:space="preserve">Deng, Z., Ali, A. M., &amp; Zin, Z. B. M. (2024). Features of hedging strategies performed by the Federal Reserve Chair in press conferences.</w:t>
+      </w:r>
+      <w:r>
+        <w:t xml:space="preserve"> </w:t>
+      </w:r>
+      <w:r>
+        <w:rPr>
+          <w:i/>
+          <w:iCs/>
+        </w:rPr>
+        <w:t xml:space="preserve">Theory and Practice in Language Studies, 14</w:t>
+      </w:r>
+      <w:r>
+        <w:t xml:space="preserve">(11), 3483–3495.</w:t>
+      </w:r>
+    </w:p>
+    <w:p>
+      <w:pPr>
+        <w:pStyle w:val="BodyText"/>
+      </w:pPr>
+      <w:r>
         <w:t xml:space="preserve">Depraetere, I., &amp; Reed, S. (2006). Mood and modality in English. In B. Aarts &amp; A. McMahon (Eds.),</w:t>
       </w:r>
       <w:r>
@@ -8391,20 +8525,20 @@
         <w:pStyle w:val="BodyText"/>
       </w:pPr>
       <w:r>
-        <w:t xml:space="preserve">Donohue, J. P. (2006). How to support a one-handed economist: The role of modalisation in economic forecasting.</w:t>
-      </w:r>
-      <w:r>
-        <w:t xml:space="preserve"> </w:t>
-      </w:r>
-      <w:r>
-        <w:rPr>
-          <w:i/>
-          <w:iCs/>
-        </w:rPr>
-        <w:t xml:space="preserve">English for Specific Purposes, 25</w:t>
-      </w:r>
-      <w:r>
-        <w:t xml:space="preserve">(2), 200–216.</w:t>
+        <w:t xml:space="preserve">Ehrmann, M., &amp; Talmi, J. (2020). Starting from a blank page? Semantic similarity in central bank communication and market volatility.</w:t>
+      </w:r>
+      <w:r>
+        <w:t xml:space="preserve"> </w:t>
+      </w:r>
+      <w:r>
+        <w:rPr>
+          <w:i/>
+          <w:iCs/>
+        </w:rPr>
+        <w:t xml:space="preserve">Journal of Monetary Economics, 111</w:t>
+      </w:r>
+      <w:r>
+        <w:t xml:space="preserve">, 48–62.</w:t>
       </w:r>
     </w:p>
     <w:p>
@@ -8412,20 +8546,23 @@
         <w:pStyle w:val="BodyText"/>
       </w:pPr>
       <w:r>
-        <w:t xml:space="preserve">Ehrmann, M., &amp; Talmi, J. (2020). Starting from a blank page? Semantic similarity in central bank communication and market volatility.</w:t>
-      </w:r>
-      <w:r>
-        <w:t xml:space="preserve"> </w:t>
-      </w:r>
-      <w:r>
-        <w:rPr>
-          <w:i/>
-          <w:iCs/>
-        </w:rPr>
-        <w:t xml:space="preserve">Journal of Monetary Economics, 111</w:t>
-      </w:r>
-      <w:r>
-        <w:t xml:space="preserve">, 48–62.</w:t>
+        <w:t xml:space="preserve">Federal Open Market Committee. (2017).</w:t>
+      </w:r>
+      <w:r>
+        <w:t xml:space="preserve"> </w:t>
+      </w:r>
+      <w:r>
+        <w:rPr>
+          <w:i/>
+          <w:iCs/>
+        </w:rPr>
+        <w:t xml:space="preserve">Addendum to the Policy Normalization Principles and Plans</w:t>
+      </w:r>
+      <w:r>
+        <w:t xml:space="preserve"> </w:t>
+      </w:r>
+      <w:r>
+        <w:t xml:space="preserve">(June 14, 2017).</w:t>
       </w:r>
     </w:p>
     <w:p>
@@ -8433,23 +8570,23 @@
         <w:pStyle w:val="BodyText"/>
       </w:pPr>
       <w:r>
-        <w:t xml:space="preserve">Federal Open Market Committee. (2017).</w:t>
-      </w:r>
-      <w:r>
-        <w:t xml:space="preserve"> </w:t>
-      </w:r>
-      <w:r>
-        <w:rPr>
-          <w:i/>
-          <w:iCs/>
-        </w:rPr>
-        <w:t xml:space="preserve">Addendum to the Policy Normalization Principles and Plans</w:t>
-      </w:r>
-      <w:r>
-        <w:t xml:space="preserve"> </w:t>
-      </w:r>
-      <w:r>
-        <w:t xml:space="preserve">(June 14, 2017).</w:t>
+        <w:t xml:space="preserve">Federal Open Market Committee. (2020).</w:t>
+      </w:r>
+      <w:r>
+        <w:t xml:space="preserve"> </w:t>
+      </w:r>
+      <w:r>
+        <w:rPr>
+          <w:i/>
+          <w:iCs/>
+        </w:rPr>
+        <w:t xml:space="preserve">Statement on Longer-Run Goals and Monetary Policy Strategy</w:t>
+      </w:r>
+      <w:r>
+        <w:t xml:space="preserve"> </w:t>
+      </w:r>
+      <w:r>
+        <w:t xml:space="preserve">(as amended effective August 27, 2020).</w:t>
       </w:r>
     </w:p>
     <w:p>
@@ -8457,23 +8594,20 @@
         <w:pStyle w:val="BodyText"/>
       </w:pPr>
       <w:r>
-        <w:t xml:space="preserve">Federal Open Market Committee. (2020).</w:t>
-      </w:r>
-      <w:r>
-        <w:t xml:space="preserve"> </w:t>
-      </w:r>
-      <w:r>
-        <w:rPr>
-          <w:i/>
-          <w:iCs/>
-        </w:rPr>
-        <w:t xml:space="preserve">Statement on Longer-Run Goals and Monetary Policy Strategy</w:t>
-      </w:r>
-      <w:r>
-        <w:t xml:space="preserve"> </w:t>
-      </w:r>
-      <w:r>
-        <w:t xml:space="preserve">(as amended effective August 27, 2020).</w:t>
+        <w:t xml:space="preserve">Gardner, B., Scotti, C., &amp; Vega, C. (2022). Words speak as loudly as actions: Central bank communication and the response of equity prices to macroeconomic announcements.</w:t>
+      </w:r>
+      <w:r>
+        <w:t xml:space="preserve"> </w:t>
+      </w:r>
+      <w:r>
+        <w:rPr>
+          <w:i/>
+          <w:iCs/>
+        </w:rPr>
+        <w:t xml:space="preserve">Journal of Econometrics, 231</w:t>
+      </w:r>
+      <w:r>
+        <w:t xml:space="preserve">(2), 387–409.</w:t>
       </w:r>
     </w:p>
     <w:p>
@@ -8481,20 +8615,20 @@
         <w:pStyle w:val="BodyText"/>
       </w:pPr>
       <w:r>
-        <w:t xml:space="preserve">Gardner, B., Scotti, C., &amp; Vega, C. (2022). Words speak as loudly as actions: Central bank communication and the response of equity prices to macroeconomic announcements.</w:t>
-      </w:r>
-      <w:r>
-        <w:t xml:space="preserve"> </w:t>
-      </w:r>
-      <w:r>
-        <w:rPr>
-          <w:i/>
-          <w:iCs/>
-        </w:rPr>
-        <w:t xml:space="preserve">Journal of Econometrics, 231</w:t>
-      </w:r>
-      <w:r>
-        <w:t xml:space="preserve">(2), 387–409.</w:t>
+        <w:t xml:space="preserve">Gorodnichenko, Y., Pham, T., &amp; Talavera, O. (2023). The voice of monetary policy.</w:t>
+      </w:r>
+      <w:r>
+        <w:t xml:space="preserve"> </w:t>
+      </w:r>
+      <w:r>
+        <w:rPr>
+          <w:i/>
+          <w:iCs/>
+        </w:rPr>
+        <w:t xml:space="preserve">American Economic Review, 113</w:t>
+      </w:r>
+      <w:r>
+        <w:t xml:space="preserve">(2), 548–584.</w:t>
       </w:r>
     </w:p>
     <w:p>
@@ -8502,20 +8636,20 @@
         <w:pStyle w:val="BodyText"/>
       </w:pPr>
       <w:r>
-        <w:t xml:space="preserve">Gorodnichenko, Y., Pham, T., &amp; Talavera, O. (2023). The voice of monetary policy.</w:t>
-      </w:r>
-      <w:r>
-        <w:t xml:space="preserve"> </w:t>
-      </w:r>
-      <w:r>
-        <w:rPr>
-          <w:i/>
-          <w:iCs/>
-        </w:rPr>
-        <w:t xml:space="preserve">American Economic Review, 113</w:t>
-      </w:r>
-      <w:r>
-        <w:t xml:space="preserve">(2), 548–584.</w:t>
+        <w:t xml:space="preserve">Granger, C. W. J. (1969). Investigating causal relations by econometric models and cross-spectral methods.</w:t>
+      </w:r>
+      <w:r>
+        <w:t xml:space="preserve"> </w:t>
+      </w:r>
+      <w:r>
+        <w:rPr>
+          <w:i/>
+          <w:iCs/>
+        </w:rPr>
+        <w:t xml:space="preserve">Econometrica, 37</w:t>
+      </w:r>
+      <w:r>
+        <w:t xml:space="preserve">(3), 424–438.</w:t>
       </w:r>
     </w:p>
     <w:p>
@@ -8523,20 +8657,29 @@
         <w:pStyle w:val="BodyText"/>
       </w:pPr>
       <w:r>
-        <w:t xml:space="preserve">Granger, C. W. J. (1969). Investigating causal relations by econometric models and cross-spectral methods.</w:t>
-      </w:r>
-      <w:r>
-        <w:t xml:space="preserve"> </w:t>
-      </w:r>
-      <w:r>
-        <w:rPr>
-          <w:i/>
-          <w:iCs/>
-        </w:rPr>
-        <w:t xml:space="preserve">Econometrica, 37</w:t>
-      </w:r>
-      <w:r>
-        <w:t xml:space="preserve">(3), 424–438.</w:t>
+        <w:t xml:space="preserve">Gries, S. Th., &amp; Stefanowitsch, A. (2004). Extending collostructional analysis: A corpus-based perspective on</w:t>
+      </w:r>
+      <w:r>
+        <w:t xml:space="preserve"> </w:t>
+      </w:r>
+      <w:r>
+        <w:t xml:space="preserve">“alternations”</w:t>
+      </w:r>
+      <w:r>
+        <w:t xml:space="preserve">.</w:t>
+      </w:r>
+      <w:r>
+        <w:t xml:space="preserve"> </w:t>
+      </w:r>
+      <w:r>
+        <w:rPr>
+          <w:i/>
+          <w:iCs/>
+        </w:rPr>
+        <w:t xml:space="preserve">International Journal of Corpus Linguistics, 9</w:t>
+      </w:r>
+      <w:r>
+        <w:t xml:space="preserve">(1), 97–129.</w:t>
       </w:r>
     </w:p>
     <w:p>
@@ -8544,50 +8687,83 @@
         <w:pStyle w:val="BodyText"/>
       </w:pPr>
       <w:r>
-        <w:t xml:space="preserve">Gries, S. Th., &amp; Stefanowitsch, A. (2004). Extending collostructional analysis: A corpus-based perspective on</w:t>
-      </w:r>
-      <w:r>
-        <w:t xml:space="preserve"> </w:t>
-      </w:r>
-      <w:r>
-        <w:t xml:space="preserve">“alternations”</w:t>
+        <w:t xml:space="preserve">Hansen, S., &amp; McMahon, M. (2016). Shocking language: Understanding the macroeconomic effects of central bank communication.</w:t>
+      </w:r>
+      <w:r>
+        <w:t xml:space="preserve"> </w:t>
+      </w:r>
+      <w:r>
+        <w:rPr>
+          <w:i/>
+          <w:iCs/>
+        </w:rPr>
+        <w:t xml:space="preserve">Journal of International Economics, 99</w:t>
+      </w:r>
+      <w:r>
+        <w:t xml:space="preserve">, S114–S133.</w:t>
+      </w:r>
+    </w:p>
+    <w:p>
+      <w:pPr>
+        <w:pStyle w:val="BodyText"/>
+      </w:pPr>
+      <w:r>
+        <w:t xml:space="preserve">Hansen, S., McMahon, M., &amp; Prat, A. (2018). Transparency and deliberation within the FOMC: A computational linguistics approach.</w:t>
+      </w:r>
+      <w:r>
+        <w:t xml:space="preserve"> </w:t>
+      </w:r>
+      <w:r>
+        <w:rPr>
+          <w:i/>
+          <w:iCs/>
+        </w:rPr>
+        <w:t xml:space="preserve">Quarterly Journal of Economics, 133</w:t>
+      </w:r>
+      <w:r>
+        <w:t xml:space="preserve">(2), 801–870.</w:t>
+      </w:r>
+    </w:p>
+    <w:p>
+      <w:pPr>
+        <w:pStyle w:val="BodyText"/>
+      </w:pPr>
+      <w:r>
+        <w:t xml:space="preserve">Honnibal, M., &amp; Montani, I. (2017).</w:t>
+      </w:r>
+      <w:r>
+        <w:t xml:space="preserve"> </w:t>
+      </w:r>
+      <w:r>
+        <w:rPr>
+          <w:i/>
+          <w:iCs/>
+        </w:rPr>
+        <w:t xml:space="preserve">spaCy 2: Natural language understanding with Bloom embeddings, convolutional neural networks and incremental parsing</w:t>
       </w:r>
       <w:r>
         <w:t xml:space="preserve">.</w:t>
       </w:r>
-      <w:r>
-        <w:t xml:space="preserve"> </w:t>
-      </w:r>
-      <w:r>
-        <w:rPr>
-          <w:i/>
-          <w:iCs/>
-        </w:rPr>
-        <w:t xml:space="preserve">International Journal of Corpus Linguistics, 9</w:t>
-      </w:r>
-      <w:r>
-        <w:t xml:space="preserve">(1), 97–129.</w:t>
-      </w:r>
     </w:p>
     <w:p>
       <w:pPr>
         <w:pStyle w:val="BodyText"/>
       </w:pPr>
       <w:r>
-        <w:t xml:space="preserve">Hansen, S., &amp; McMahon, M. (2016). Shocking language: Understanding the macroeconomic effects of central bank communication.</w:t>
-      </w:r>
-      <w:r>
-        <w:t xml:space="preserve"> </w:t>
-      </w:r>
-      <w:r>
-        <w:rPr>
-          <w:i/>
-          <w:iCs/>
-        </w:rPr>
-        <w:t xml:space="preserve">Journal of International Economics, 99</w:t>
-      </w:r>
-      <w:r>
-        <w:t xml:space="preserve">, S114–S133.</w:t>
+        <w:t xml:space="preserve">Hyland, K. (1996). Writing without conviction? Hedging in scientific research articles.</w:t>
+      </w:r>
+      <w:r>
+        <w:t xml:space="preserve"> </w:t>
+      </w:r>
+      <w:r>
+        <w:rPr>
+          <w:i/>
+          <w:iCs/>
+        </w:rPr>
+        <w:t xml:space="preserve">Applied Linguistics, 17</w:t>
+      </w:r>
+      <w:r>
+        <w:t xml:space="preserve">(4), 433–454.</w:t>
       </w:r>
     </w:p>
     <w:p>
@@ -8595,20 +8771,20 @@
         <w:pStyle w:val="BodyText"/>
       </w:pPr>
       <w:r>
-        <w:t xml:space="preserve">Hansen, S., McMahon, M., &amp; Prat, A. (2018). Transparency and deliberation within the FOMC: A computational linguistics approach.</w:t>
-      </w:r>
-      <w:r>
-        <w:t xml:space="preserve"> </w:t>
-      </w:r>
-      <w:r>
-        <w:rPr>
-          <w:i/>
-          <w:iCs/>
-        </w:rPr>
-        <w:t xml:space="preserve">Quarterly Journal of Economics, 133</w:t>
-      </w:r>
-      <w:r>
-        <w:t xml:space="preserve">(2), 801–870.</w:t>
+        <w:t xml:space="preserve">Hyland, K. (1998).</w:t>
+      </w:r>
+      <w:r>
+        <w:t xml:space="preserve"> </w:t>
+      </w:r>
+      <w:r>
+        <w:rPr>
+          <w:i/>
+          <w:iCs/>
+        </w:rPr>
+        <w:t xml:space="preserve">Hedging in scientific research articles</w:t>
+      </w:r>
+      <w:r>
+        <w:t xml:space="preserve">. John Benjamins.</w:t>
       </w:r>
     </w:p>
     <w:p>
@@ -8616,20 +8792,20 @@
         <w:pStyle w:val="BodyText"/>
       </w:pPr>
       <w:r>
-        <w:t xml:space="preserve">Honnibal, M., &amp; Montani, I. (2017).</w:t>
-      </w:r>
-      <w:r>
-        <w:t xml:space="preserve"> </w:t>
-      </w:r>
-      <w:r>
-        <w:rPr>
-          <w:i/>
-          <w:iCs/>
-        </w:rPr>
-        <w:t xml:space="preserve">spaCy 2: Natural language understanding with Bloom embeddings, convolutional neural networks and incremental parsing</w:t>
-      </w:r>
-      <w:r>
-        <w:t xml:space="preserve">.</w:t>
+        <w:t xml:space="preserve">Kaplan, E. L., &amp; Meier, P. (1958). Nonparametric estimation from incomplete observations.</w:t>
+      </w:r>
+      <w:r>
+        <w:t xml:space="preserve"> </w:t>
+      </w:r>
+      <w:r>
+        <w:rPr>
+          <w:i/>
+          <w:iCs/>
+        </w:rPr>
+        <w:t xml:space="preserve">Journal of the American Statistical Association, 53</w:t>
+      </w:r>
+      <w:r>
+        <w:t xml:space="preserve">(282), 457–481.</w:t>
       </w:r>
     </w:p>
     <w:p>
@@ -8637,20 +8813,20 @@
         <w:pStyle w:val="BodyText"/>
       </w:pPr>
       <w:r>
-        <w:t xml:space="preserve">Hyland, K. (1996). Writing without conviction? Hedging in scientific research articles.</w:t>
-      </w:r>
-      <w:r>
-        <w:t xml:space="preserve"> </w:t>
-      </w:r>
-      <w:r>
-        <w:rPr>
-          <w:i/>
-          <w:iCs/>
-        </w:rPr>
-        <w:t xml:space="preserve">Applied Linguistics, 17</w:t>
-      </w:r>
-      <w:r>
-        <w:t xml:space="preserve">(4), 433–454.</w:t>
+        <w:t xml:space="preserve">Kawamura, K., Kobashi, Y., Shizume, M., &amp; Ueda, K. (2019). Strategic central bank communication: Discourse analysis of the Bank of Japan’s Monthly Report.</w:t>
+      </w:r>
+      <w:r>
+        <w:t xml:space="preserve"> </w:t>
+      </w:r>
+      <w:r>
+        <w:rPr>
+          <w:i/>
+          <w:iCs/>
+        </w:rPr>
+        <w:t xml:space="preserve">Journal of Economic Dynamics and Control, 100</w:t>
+      </w:r>
+      <w:r>
+        <w:t xml:space="preserve">, 230–250.</w:t>
       </w:r>
     </w:p>
     <w:p>
@@ -8658,20 +8834,20 @@
         <w:pStyle w:val="BodyText"/>
       </w:pPr>
       <w:r>
-        <w:t xml:space="preserve">Hyland, K. (1998).</w:t>
-      </w:r>
-      <w:r>
-        <w:t xml:space="preserve"> </w:t>
-      </w:r>
-      <w:r>
-        <w:rPr>
-          <w:i/>
-          <w:iCs/>
-        </w:rPr>
-        <w:t xml:space="preserve">Hedging in scientific research articles</w:t>
-      </w:r>
-      <w:r>
-        <w:t xml:space="preserve">. John Benjamins.</w:t>
+        <w:t xml:space="preserve">Killick, R., Fearnhead, P., &amp; Eckley, I. A. (2012). Optimal detection of changepoints with a linear computational cost.</w:t>
+      </w:r>
+      <w:r>
+        <w:t xml:space="preserve"> </w:t>
+      </w:r>
+      <w:r>
+        <w:rPr>
+          <w:i/>
+          <w:iCs/>
+        </w:rPr>
+        <w:t xml:space="preserve">Journal of the American Statistical Association, 107</w:t>
+      </w:r>
+      <w:r>
+        <w:t xml:space="preserve">(500), 1590–1598.</w:t>
       </w:r>
     </w:p>
     <w:p>
@@ -8679,20 +8855,23 @@
         <w:pStyle w:val="BodyText"/>
       </w:pPr>
       <w:r>
-        <w:t xml:space="preserve">Kaplan, E. L., &amp; Meier, P. (1958). Nonparametric estimation from incomplete observations.</w:t>
-      </w:r>
-      <w:r>
-        <w:t xml:space="preserve"> </w:t>
-      </w:r>
-      <w:r>
-        <w:rPr>
-          <w:i/>
-          <w:iCs/>
-        </w:rPr>
-        <w:t xml:space="preserve">Journal of the American Statistical Association, 53</w:t>
-      </w:r>
-      <w:r>
-        <w:t xml:space="preserve">(282), 457–481.</w:t>
+        <w:t xml:space="preserve">Leech, G. (2004). Recent grammatical change in English: Data, description, theory. In K. Aijmer &amp; B. Altenberg (Eds.),</w:t>
+      </w:r>
+      <w:r>
+        <w:t xml:space="preserve"> </w:t>
+      </w:r>
+      <w:r>
+        <w:rPr>
+          <w:i/>
+          <w:iCs/>
+        </w:rPr>
+        <w:t xml:space="preserve">Advances in corpus linguistics: Papers from ICAME 23</w:t>
+      </w:r>
+      <w:r>
+        <w:t xml:space="preserve"> </w:t>
+      </w:r>
+      <w:r>
+        <w:t xml:space="preserve">(pp. 61–81). Rodopi.</w:t>
       </w:r>
     </w:p>
     <w:p>
@@ -8700,20 +8879,20 @@
         <w:pStyle w:val="BodyText"/>
       </w:pPr>
       <w:r>
-        <w:t xml:space="preserve">Kawamura, K., Kobashi, Y., Shizume, M., &amp; Ueda, K. (2019). Strategic central bank communication: Discourse analysis of the Bank of Japan’s Monthly Report.</w:t>
-      </w:r>
-      <w:r>
-        <w:t xml:space="preserve"> </w:t>
-      </w:r>
-      <w:r>
-        <w:rPr>
-          <w:i/>
-          <w:iCs/>
-        </w:rPr>
-        <w:t xml:space="preserve">Journal of Economic Dynamics and Control, 100</w:t>
-      </w:r>
-      <w:r>
-        <w:t xml:space="preserve">, 230–250.</w:t>
+        <w:t xml:space="preserve">Leech, G., Hundt, M., Mair, C., &amp; Smith, N. (2009).</w:t>
+      </w:r>
+      <w:r>
+        <w:t xml:space="preserve"> </w:t>
+      </w:r>
+      <w:r>
+        <w:rPr>
+          <w:i/>
+          <w:iCs/>
+        </w:rPr>
+        <w:t xml:space="preserve">Change in contemporary English: A grammatical study</w:t>
+      </w:r>
+      <w:r>
+        <w:t xml:space="preserve">. Cambridge University Press.</w:t>
       </w:r>
     </w:p>
     <w:p>
@@ -8721,20 +8900,20 @@
         <w:pStyle w:val="BodyText"/>
       </w:pPr>
       <w:r>
-        <w:t xml:space="preserve">Killick, R., Fearnhead, P., &amp; Eckley, I. A. (2012). Optimal detection of changepoints with a linear computational cost.</w:t>
-      </w:r>
-      <w:r>
-        <w:t xml:space="preserve"> </w:t>
-      </w:r>
-      <w:r>
-        <w:rPr>
-          <w:i/>
-          <w:iCs/>
-        </w:rPr>
-        <w:t xml:space="preserve">Journal of the American Statistical Association, 107</w:t>
-      </w:r>
-      <w:r>
-        <w:t xml:space="preserve">(500), 1590–1598.</w:t>
+        <w:t xml:space="preserve">Loughran, T., &amp; McDonald, B. (2011). When is a liability not a liability? Textual analysis, dictionaries, and 10-Ks.</w:t>
+      </w:r>
+      <w:r>
+        <w:t xml:space="preserve"> </w:t>
+      </w:r>
+      <w:r>
+        <w:rPr>
+          <w:i/>
+          <w:iCs/>
+        </w:rPr>
+        <w:t xml:space="preserve">Journal of Finance, 66</w:t>
+      </w:r>
+      <w:r>
+        <w:t xml:space="preserve">(1), 35–65.</w:t>
       </w:r>
     </w:p>
     <w:p>
@@ -8742,23 +8921,23 @@
         <w:pStyle w:val="BodyText"/>
       </w:pPr>
       <w:r>
-        <w:t xml:space="preserve">Leech, G. (2003). Modality on the move: The English modal auxiliaries 1961–1992. In R. Facchinetti, M. Krug, &amp; F. Palmer (Eds.),</w:t>
-      </w:r>
-      <w:r>
-        <w:t xml:space="preserve"> </w:t>
-      </w:r>
-      <w:r>
-        <w:rPr>
-          <w:i/>
-          <w:iCs/>
-        </w:rPr>
-        <w:t xml:space="preserve">Modality in contemporary English</w:t>
-      </w:r>
-      <w:r>
-        <w:t xml:space="preserve"> </w:t>
-      </w:r>
-      <w:r>
-        <w:t xml:space="preserve">(pp. 223–240). Mouton de Gruyter.</w:t>
+        <w:t xml:space="preserve">Lucca, D. O., &amp; Trebbi, F. (2009).</w:t>
+      </w:r>
+      <w:r>
+        <w:t xml:space="preserve"> </w:t>
+      </w:r>
+      <w:r>
+        <w:rPr>
+          <w:i/>
+          <w:iCs/>
+        </w:rPr>
+        <w:t xml:space="preserve">Measuring central bank communication: An automated approach with application to FOMC statements</w:t>
+      </w:r>
+      <w:r>
+        <w:t xml:space="preserve"> </w:t>
+      </w:r>
+      <w:r>
+        <w:t xml:space="preserve">(NBER Working Paper 15367).</w:t>
       </w:r>
     </w:p>
     <w:p>
@@ -8766,20 +8945,20 @@
         <w:pStyle w:val="BodyText"/>
       </w:pPr>
       <w:r>
-        <w:t xml:space="preserve">Leech, G., Hundt, M., Mair, C., &amp; Smith, N. (2009).</w:t>
-      </w:r>
-      <w:r>
-        <w:t xml:space="preserve"> </w:t>
-      </w:r>
-      <w:r>
-        <w:rPr>
-          <w:i/>
-          <w:iCs/>
-        </w:rPr>
-        <w:t xml:space="preserve">Change in contemporary English: A grammatical study</w:t>
-      </w:r>
-      <w:r>
-        <w:t xml:space="preserve">. Cambridge University Press.</w:t>
+        <w:t xml:space="preserve">Mann, H. B. (1945). Nonparametric tests against trend.</w:t>
+      </w:r>
+      <w:r>
+        <w:t xml:space="preserve"> </w:t>
+      </w:r>
+      <w:r>
+        <w:rPr>
+          <w:i/>
+          <w:iCs/>
+        </w:rPr>
+        <w:t xml:space="preserve">Econometrica, 13</w:t>
+      </w:r>
+      <w:r>
+        <w:t xml:space="preserve">(3), 245–259.</w:t>
       </w:r>
     </w:p>
     <w:p>
@@ -8787,20 +8966,23 @@
         <w:pStyle w:val="BodyText"/>
       </w:pPr>
       <w:r>
-        <w:t xml:space="preserve">Loughran, T., &amp; McDonald, B. (2011). When is a liability not a liability? Textual analysis, dictionaries, and 10-Ks.</w:t>
-      </w:r>
-      <w:r>
-        <w:t xml:space="preserve"> </w:t>
-      </w:r>
-      <w:r>
-        <w:rPr>
-          <w:i/>
-          <w:iCs/>
-        </w:rPr>
-        <w:t xml:space="preserve">Journal of Finance, 66</w:t>
-      </w:r>
-      <w:r>
-        <w:t xml:space="preserve">(1), 35–65.</w:t>
+        <w:t xml:space="preserve">Mair, C., &amp; Leech, G. (2006). Current changes in English syntax. In B. Aarts &amp; A. McMahon (Eds.),</w:t>
+      </w:r>
+      <w:r>
+        <w:t xml:space="preserve"> </w:t>
+      </w:r>
+      <w:r>
+        <w:rPr>
+          <w:i/>
+          <w:iCs/>
+        </w:rPr>
+        <w:t xml:space="preserve">The handbook of English linguistics</w:t>
+      </w:r>
+      <w:r>
+        <w:t xml:space="preserve"> </w:t>
+      </w:r>
+      <w:r>
+        <w:t xml:space="preserve">(pp. 318–342). Blackwell.</w:t>
       </w:r>
     </w:p>
     <w:p>
@@ -8808,23 +8990,23 @@
         <w:pStyle w:val="BodyText"/>
       </w:pPr>
       <w:r>
-        <w:t xml:space="preserve">Lucca, D. O., &amp; Trebbi, F. (2009).</w:t>
-      </w:r>
-      <w:r>
-        <w:t xml:space="preserve"> </w:t>
-      </w:r>
-      <w:r>
-        <w:rPr>
-          <w:i/>
-          <w:iCs/>
-        </w:rPr>
-        <w:t xml:space="preserve">Measuring central bank communication: An automated approach with application to FOMC statements</w:t>
-      </w:r>
-      <w:r>
-        <w:t xml:space="preserve"> </w:t>
-      </w:r>
-      <w:r>
-        <w:t xml:space="preserve">(NBER Working Paper 15367).</w:t>
+        <w:t xml:space="preserve">Meade, E. E., &amp; Acosta, M. (2015).</w:t>
+      </w:r>
+      <w:r>
+        <w:t xml:space="preserve"> </w:t>
+      </w:r>
+      <w:r>
+        <w:rPr>
+          <w:i/>
+          <w:iCs/>
+        </w:rPr>
+        <w:t xml:space="preserve">Hanging on every word: Semantic analysis of the FOMC’s postmeeting statement</w:t>
+      </w:r>
+      <w:r>
+        <w:t xml:space="preserve"> </w:t>
+      </w:r>
+      <w:r>
+        <w:t xml:space="preserve">(FEDS Notes, September 30). Board of Governors of the Federal Reserve System.</w:t>
       </w:r>
     </w:p>
     <w:p>
@@ -8832,20 +9014,20 @@
         <w:pStyle w:val="BodyText"/>
       </w:pPr>
       <w:r>
-        <w:t xml:space="preserve">Mann, H. B. (1945). Nonparametric tests against trend.</w:t>
-      </w:r>
-      <w:r>
-        <w:t xml:space="preserve"> </w:t>
-      </w:r>
-      <w:r>
-        <w:rPr>
-          <w:i/>
-          <w:iCs/>
-        </w:rPr>
-        <w:t xml:space="preserve">Econometrica, 13</w:t>
-      </w:r>
-      <w:r>
-        <w:t xml:space="preserve">(3), 245–259.</w:t>
+        <w:t xml:space="preserve">Millar, N. (2009). Modal verbs in TIME: Frequency changes 1923–2006.</w:t>
+      </w:r>
+      <w:r>
+        <w:t xml:space="preserve"> </w:t>
+      </w:r>
+      <w:r>
+        <w:rPr>
+          <w:i/>
+          <w:iCs/>
+        </w:rPr>
+        <w:t xml:space="preserve">International Journal of Corpus Linguistics, 14</w:t>
+      </w:r>
+      <w:r>
+        <w:t xml:space="preserve">(2), 191–220.</w:t>
       </w:r>
     </w:p>
     <w:p>
@@ -8853,23 +9035,20 @@
         <w:pStyle w:val="BodyText"/>
       </w:pPr>
       <w:r>
-        <w:t xml:space="preserve">Meade, E. E., &amp; Acosta, M. (2015).</w:t>
-      </w:r>
-      <w:r>
-        <w:t xml:space="preserve"> </w:t>
-      </w:r>
-      <w:r>
-        <w:rPr>
-          <w:i/>
-          <w:iCs/>
-        </w:rPr>
-        <w:t xml:space="preserve">Hanging on every word: Semantic analysis of the FOMC’s postmeeting statement</w:t>
-      </w:r>
-      <w:r>
-        <w:t xml:space="preserve"> </w:t>
-      </w:r>
-      <w:r>
-        <w:t xml:space="preserve">(FEDS Notes, September 30). Board of Governors of the Federal Reserve System.</w:t>
+        <w:t xml:space="preserve">Newey, W. K., &amp; West, K. D. (1987). A simple, positive semi-definite, heteroskedasticity and autocorrelation consistent covariance matrix.</w:t>
+      </w:r>
+      <w:r>
+        <w:t xml:space="preserve"> </w:t>
+      </w:r>
+      <w:r>
+        <w:rPr>
+          <w:i/>
+          <w:iCs/>
+        </w:rPr>
+        <w:t xml:space="preserve">Econometrica, 55</w:t>
+      </w:r>
+      <w:r>
+        <w:t xml:space="preserve">(3), 703–708.</w:t>
       </w:r>
     </w:p>
     <w:p>
@@ -8877,20 +9056,20 @@
         <w:pStyle w:val="BodyText"/>
       </w:pPr>
       <w:r>
-        <w:t xml:space="preserve">Millar, N. (2009). Modal verbs in TIME: Frequency changes 1923–2006.</w:t>
-      </w:r>
-      <w:r>
-        <w:t xml:space="preserve"> </w:t>
-      </w:r>
-      <w:r>
-        <w:rPr>
-          <w:i/>
-          <w:iCs/>
-        </w:rPr>
-        <w:t xml:space="preserve">International Journal of Corpus Linguistics, 14</w:t>
-      </w:r>
-      <w:r>
-        <w:t xml:space="preserve">(2), 191–220.</w:t>
+        <w:t xml:space="preserve">Nuyts, J. (2001). Subjectivity as an evidential dimension in epistemic modal expressions.</w:t>
+      </w:r>
+      <w:r>
+        <w:t xml:space="preserve"> </w:t>
+      </w:r>
+      <w:r>
+        <w:rPr>
+          <w:i/>
+          <w:iCs/>
+        </w:rPr>
+        <w:t xml:space="preserve">Journal of Pragmatics, 33</w:t>
+      </w:r>
+      <w:r>
+        <w:t xml:space="preserve">(3), 383–400.</w:t>
       </w:r>
     </w:p>
     <w:p>
@@ -8898,20 +9077,23 @@
         <w:pStyle w:val="BodyText"/>
       </w:pPr>
       <w:r>
-        <w:t xml:space="preserve">Newey, W. K., &amp; West, K. D. (1987). A simple, positive semi-definite, heteroskedasticity and autocorrelation consistent covariance matrix.</w:t>
-      </w:r>
-      <w:r>
-        <w:t xml:space="preserve"> </w:t>
-      </w:r>
-      <w:r>
-        <w:rPr>
-          <w:i/>
-          <w:iCs/>
-        </w:rPr>
-        <w:t xml:space="preserve">Econometrica, 55</w:t>
-      </w:r>
-      <w:r>
-        <w:t xml:space="preserve">(3), 703–708.</w:t>
+        <w:t xml:space="preserve">Palmer, F. R. (1990).</w:t>
+      </w:r>
+      <w:r>
+        <w:t xml:space="preserve"> </w:t>
+      </w:r>
+      <w:r>
+        <w:rPr>
+          <w:i/>
+          <w:iCs/>
+        </w:rPr>
+        <w:t xml:space="preserve">Modality and the English modals</w:t>
+      </w:r>
+      <w:r>
+        <w:t xml:space="preserve"> </w:t>
+      </w:r>
+      <w:r>
+        <w:t xml:space="preserve">(2nd ed.). Longman.</w:t>
       </w:r>
     </w:p>
     <w:p>
@@ -8919,51 +9101,6 @@
         <w:pStyle w:val="BodyText"/>
       </w:pPr>
       <w:r>
-        <w:t xml:space="preserve">Nuyts, J. (2001). Subjectivity as an evidential dimension in epistemic modal expressions.</w:t>
-      </w:r>
-      <w:r>
-        <w:t xml:space="preserve"> </w:t>
-      </w:r>
-      <w:r>
-        <w:rPr>
-          <w:i/>
-          <w:iCs/>
-        </w:rPr>
-        <w:t xml:space="preserve">Journal of Pragmatics, 33</w:t>
-      </w:r>
-      <w:r>
-        <w:t xml:space="preserve">(3), 383–400.</w:t>
-      </w:r>
-    </w:p>
-    <w:p>
-      <w:pPr>
-        <w:pStyle w:val="BodyText"/>
-      </w:pPr>
-      <w:r>
-        <w:t xml:space="preserve">Palmer, F. R. (1990).</w:t>
-      </w:r>
-      <w:r>
-        <w:t xml:space="preserve"> </w:t>
-      </w:r>
-      <w:r>
-        <w:rPr>
-          <w:i/>
-          <w:iCs/>
-        </w:rPr>
-        <w:t xml:space="preserve">Modality and the English modals</w:t>
-      </w:r>
-      <w:r>
-        <w:t xml:space="preserve"> </w:t>
-      </w:r>
-      <w:r>
-        <w:t xml:space="preserve">(2nd ed.). Longman.</w:t>
-      </w:r>
-    </w:p>
-    <w:p>
-      <w:pPr>
-        <w:pStyle w:val="BodyText"/>
-      </w:pPr>
-      <w:r>
         <w:t xml:space="preserve">Palmer, F. R. (2001).</w:t>
       </w:r>
       <w:r>
@@ -8981,30 +9118,6 @@
       </w:r>
       <w:r>
         <w:t xml:space="preserve">(2nd ed.). Cambridge University Press.</w:t>
-      </w:r>
-    </w:p>
-    <w:p>
-      <w:pPr>
-        <w:pStyle w:val="BodyText"/>
-      </w:pPr>
-      <w:r>
-        <w:t xml:space="preserve">Pindi, M., &amp; Bloor, T. (1987). Playing safe with predictions: Hedging, attribution and conditions in economic forecasting. In T. Bloor &amp; J. Norrish (Eds.),</w:t>
-      </w:r>
-      <w:r>
-        <w:t xml:space="preserve"> </w:t>
-      </w:r>
-      <w:r>
-        <w:rPr>
-          <w:i/>
-          <w:iCs/>
-        </w:rPr>
-        <w:t xml:space="preserve">Written language</w:t>
-      </w:r>
-      <w:r>
-        <w:t xml:space="preserve"> </w:t>
-      </w:r>
-      <w:r>
-        <w:t xml:space="preserve">(CILT 55). CILT.</w:t>
       </w:r>
     </w:p>
     <w:p>

</xml_diff>